<commit_message>
feat(methodology): update conceptual framework
</commit_message>
<xml_diff>
--- a/chapters/04-methodology/draft.docx
+++ b/chapters/04-methodology/draft.docx
@@ -1653,7 +1653,7 @@
         <w:pStyle w:val="FirstParagraph"/>
       </w:pPr>
       <w:r>
-        <w:t xml:space="preserve">The framework follows an input-process-output (IPO) structure, shown in Figure 8. The input is a graphic designer and the generative-AI image they supply. That image is a full scene, not a pre-cut crop: its text is probabilistically deformed, and it may hold several text regions, some set in fonts outside the palette. The process moves through four steps. A web-app frontend accepts the upload and displays results, a backend API routes the request, and an off-the-shelf text localizer isolates and crops each text region. Every crop is then passed independently to the ML inference engine, which performs the recognition that is the focus of this thesis. The localizer is a standard component and not a contribution of this work; the unit of analysis is the isolated crop, as stated in Section 4.1. Inside the engine, a crop is preprocessed, encoded by a frozen DINOv2 Vision Transformer, projected by the metric head</w:t>
+        <w:t xml:space="preserve">The framework follows an input-process-output (IPO) structure, shown in Figure 8. The input column holds the graphic designer, the generative-AI image they supply, and the web-app UI through which they interact with the system. That image is a full scene, not a pre-cut crop: its text is probabilistically deformed, and it may hold several text regions, some set in fonts outside the palette. The web-app UI is drawn on the input side deliberately: it is the system boundary, not a processing stage, so it accepts the upload, hands it to the backend, and later displays whatever comes back. The process column is the backend API, which runs the recognition pipeline for each request. An off-the-shelf text localizer first isolates and crops each text region; the localizer is a standard component and not a contribution of this work, and the unit of analysis is the isolated crop, as stated in Section 4.1. Every crop then passes independently through the ML inference engine, the focus of this thesis: the crop is preprocessed, encoded by the frozen DINOv2 Vision Transformer, projected by the student metric head</w:t>
       </w:r>
       <w:r>
         <w:t xml:space="preserve"> </w:t>
@@ -1676,7 +1676,7 @@
         <w:t xml:space="preserve"> </w:t>
       </w:r>
       <w:r>
-        <w:t xml:space="preserve">into a font-style embedding, and passed to the open-set decision that either rejects the crop as unknown or ranks the palette. Because the engine runs per crop, an image with several text regions produces one Top-K Google Fonts shortlist, or one unknown verdict, per region, and the results return to the designer for free template reuse. A separate offline subsystem, the researchers’ synthetic rendering, degradation, and triplet-training pipeline, produces the trained weights the engine loads, and appears as the lower band feeding the encoder and head.</w:t>
+        <w:t xml:space="preserve">into a font-style embedding, and passed to the open-set decision that either rejects the crop as unknown or emits the calibrated Top-K ranking of the palette. On the output side, an accepted crop yields a Top-K Google Fonts shortlist that is checked by the re-render-and-compare instrument of Section 4.2.2 before the designer reuses the matched font freely, while a rejected crop yields an explicit unknown verdict. Because the engine runs per crop, an image with several text regions produces one shortlist or one verdict per region, which the web-app UI then displays to the designer. A separate offline subsystem, the researchers’ synthetic rendering, degradation, and training pipeline, produces the trained model the engine loads, and appears as the enclosed lower band of the figure.</w:t>
       </w:r>
     </w:p>
     <w:p>
@@ -1710,9 +1710,9 @@
       <w:r>
         <w:drawing>
           <wp:inline>
-            <wp:extent cx="5334000" cy="4038359"/>
+            <wp:extent cx="5334000" cy="4848022"/>
             <wp:effectExtent b="0" l="0" r="0" t="0"/>
-            <wp:docPr descr="Input-process-output diagram showing a graphic designer and GenAI image feeding a web-app frontend, a backend API, an off-the-shelf text localizer that crops each text region, and the ML inference engine (preprocessing, frozen DINOv2 encoder, metric head, open-set decision) run per crop, producing a Top-K Google Fonts shortlist or unknown verdict per region, with an offline synthetic-training subsystem supplying the model weights" title="" id="22" name="Picture"/>
+            <wp:docPr descr="Input-process-output diagram with three enclosed columns and an enclosed offline-training band. Input: a graphic designer supplies a GenAI image with deformed text through the web-app UI, the system boundary. Process: the backend recognition pipeline runs an off-the-shelf text localizer and then, per crop, preprocessing, a frozen DINOv2 encoder, the student metric head, and the open-set decision. Output: an accepted crop yields a conformal Top-K Google Fonts shortlist, checked by a re-render structural comparison and then reused freely; a rejected crop yields an unknown verdict. Below, the offline training band (Google Fonts palette, synthetic render, degradation, metric-head training with triplet loss and LoRA-teacher distillation) ends in the trained model whose weights and threshold load into the engine at startup. An in-figure legend defines solid arrows as runtime flow and dashed arrows as offline flow" title="" id="22" name="Picture"/>
             <a:graphic>
               <a:graphicData uri="http://schemas.openxmlformats.org/drawingml/2006/picture">
                 <pic:pic>
@@ -1731,7 +1731,7 @@
                   <pic:spPr bwMode="auto">
                     <a:xfrm>
                       <a:off x="0" y="0"/>
-                      <a:ext cx="5334000" cy="4038359"/>
+                      <a:ext cx="5334000" cy="4848022"/>
                     </a:xfrm>
                     <a:prstGeom prst="rect">
                       <a:avLst/>
@@ -1755,7 +1755,7 @@
         <w:pStyle w:val="ImageCaption"/>
       </w:pPr>
       <w:r>
-        <w:t xml:space="preserve">Input-process-output diagram showing a graphic designer and GenAI image feeding a web-app frontend, a backend API, an off-the-shelf text localizer that crops each text region, and the ML inference engine (preprocessing, frozen DINOv2 encoder, metric head, open-set decision) run per crop, producing a Top-K Google Fonts shortlist or unknown verdict per region, with an offline synthetic-training subsystem supplying the model weights</w:t>
+        <w:t xml:space="preserve">Input-process-output diagram with three enclosed columns and an enclosed offline-training band. Input: a graphic designer supplies a GenAI image with deformed text through the web-app UI, the system boundary. Process: the backend recognition pipeline runs an off-the-shelf text localizer and then, per crop, preprocessing, a frozen DINOv2 encoder, the student metric head, and the open-set decision. Output: an accepted crop yields a conformal Top-K Google Fonts shortlist, checked by a re-render structural comparison and then reused freely; a rejected crop yields an unknown verdict. Below, the offline training band (Google Fonts palette, synthetic render, degradation, metric-head training with triplet loss and LoRA-teacher distillation) ends in the trained model whose weights and threshold load into the engine at startup. An in-figure legend defines solid arrows as runtime flow and dashed arrows as offline flow</w:t>
       </w:r>
     </w:p>
     <w:p>
@@ -1763,7 +1763,52 @@
         <w:pStyle w:val="BodyText"/>
       </w:pPr>
       <w:r>
-        <w:t xml:space="preserve">As shown in Figure 8, the runtime path (designer to frontend to backend to localizer to inference engine to shortlist) is cleanly separated from the offline training path (Google Fonts to synthetic render to degradation to triplet training). The two meet at a single point: the trained weights loaded by the frozen encoder and metric head. The localizer sits before the engine as a replaceable off-the-shelf stage, which keeps the thesis focused on the recognition that follows it. This separation is what lets the same model serve real-time web requests while remaining fully reproducible from the researcher-controlled data pipeline.</w:t>
+        <w:t xml:space="preserve">Figure 8 is read through its line convention, stated in the legend. Solid arrows mark the runtime path, which runs for every uploaded image: from the upload in the web-app UI through the backend’s localizer and inference engine, out to the verified shortlist or the unknown verdict. The web-app UI sits at the system boundary on the input side, where the designer both submits the image and reads the returned result. Dashed arrows mark the offline path, which the researchers run once before deployment: the Google Fonts palette is rendered, degraded by the operator</w:t>
+      </w:r>
+      <w:r>
+        <w:t xml:space="preserve"> </w:t>
+      </w:r>
+      <m:oMath>
+        <m:r>
+          <m:t>D</m:t>
+        </m:r>
+      </m:oMath>
+      <w:r>
+        <w:t xml:space="preserve">, and used to train the metric head with the triplet objective of Chapter 3 together with distillation from the LoRA-tuned teacher of Section 4.3.2, ending in the trained model (the learned weights</w:t>
+      </w:r>
+      <w:r>
+        <w:t xml:space="preserve"> </w:t>
+      </w:r>
+      <m:oMath>
+        <m:sSub>
+          <m:e>
+            <m:r>
+              <m:t>f</m:t>
+            </m:r>
+          </m:e>
+          <m:sub>
+            <m:r>
+              <m:t>θ</m:t>
+            </m:r>
+          </m:sub>
+        </m:sSub>
+      </m:oMath>
+      <w:r>
+        <w:t xml:space="preserve"> </w:t>
+      </w:r>
+      <w:r>
+        <w:t xml:space="preserve">and the calibrated rejection threshold</w:t>
+      </w:r>
+      <w:r>
+        <w:t xml:space="preserve"> </w:t>
+      </w:r>
+      <m:oMath>
+        <m:r>
+          <m:t>τ</m:t>
+        </m:r>
+      </m:oMath>
+      <w:r>
+        <w:t xml:space="preserve">). The two paths meet at exactly one point: at startup the engine loads the trained model, a hand-off drawn dashed because it precedes, rather than belongs to, the per-request flow. The localizer stays inside the runtime path with a solid border because it runs live on every request; it is off-the-shelf and replaceable, which keeps the thesis focused on the recognition that follows it. This separation is what lets the same model serve real-time web requests while remaining fully reproducible from the researcher-controlled data pipeline.</w:t>
       </w:r>
     </w:p>
     <w:bookmarkEnd w:id="24"/>

</xml_diff>